<commit_message>
fix: terminate desktop API process tree on exit
</commit_message>
<xml_diff>
--- a/qubit-v2/data/QUBIT_paper.docx
+++ b/qubit-v2/data/QUBIT_paper.docx
@@ -49,7 +49,7 @@
         <w:spacing w:after="140"/>
       </w:pPr>
       <w:r>
-        <w:t>Post-quantum cryptography (PQC) migration is not a search-and-replace exercise: a source-level change can be syntactically valid yet violate protocol compatibility, persistence formats, or cryptographic usage constraints. This paper presents QUBIT, a local-first research prototype for governance-aware PQC migration. QUBIT separates discovery, planning, candidate generation, validation, and explicit approval; it records the evidence supporting each transition instead of treating a generated patch as proof of correctness. The release described here strengthens the prototype in five places: source-evidence re-anchoring after edits, auditable task reopening, deterministic sandbox selection, persisted scan completion metadata, and an opt-in boundary for external source processing. A production dashboard build also reduces bundled CSS from 103.85 KB to 58.93 KB by shipping only the Latin font subsets used by the interface. Verification is deliberately scoped: a focused backend suite executed 98 tests successfully, the dashboard production build succeeded, and a compiled Windows desktop run exercised scan, task reopening, candidate generation, rejection, and the apply safety gate. These observations do not establish general migration correctness. They demonstrate a reproducible, evidence-gated basis for evaluating source-level PQC migration without overstating what an automated tool has proved.</w:t>
+        <w:t>Post-quantum cryptography (PQC) migration is not a search-and-replace exercise: a source-level change can be syntactically valid yet violate protocol compatibility, persistence formats, or cryptographic usage constraints. This paper presents QUBIT, a local-first research prototype for governance-aware PQC migration. QUBIT separates discovery, planning, candidate generation, validation, and explicit approval; it records the evidence supporting each transition instead of treating a generated patch as proof of correctness. The release described here strengthens the prototype in six places: source-evidence re-anchoring after edits, auditable task reopening, deterministic sandbox selection, persisted scan completion metadata, an opt-in boundary for external source processing, and Windows process-tree shutdown. A production dashboard build also reduces bundled CSS from 103.85 KB to 58.93 KB by shipping only the Latin font subsets used by the interface. Verification is deliberately scoped: a focused backend suite executed 98 tests successfully, the dashboard production build succeeded, and a compiled Windows desktop run exercised scan, task reopening, candidate generation, rejection, the apply safety gate, and clean shutdown. These observations do not establish general migration correctness. They demonstrate a reproducible, evidence-gated basis for evaluating source-level PQC migration without overstating what an automated tool has proved.</w:t>
       </w:r>
     </w:p>
     <w:p>
@@ -678,6 +678,99 @@
               <w:jc w:val="center"/>
             </w:pPr>
             <w:r>
+              <w:t>Desktop lifecycle</w:t>
+            </w:r>
+          </w:p>
+        </w:tc>
+        <w:tc>
+          <w:tcPr>
+            <w:tcW w:type="dxa" w:w="3499"/>
+            <w:tcBorders>
+              <w:top w:val="single" w:sz="4" w:color="D9D9D9"/>
+              <w:left w:val="single" w:sz="4" w:color="D9D9D9"/>
+              <w:bottom w:val="single" w:sz="4" w:color="D9D9D9"/>
+              <w:right w:val="single" w:sz="4" w:color="D9D9D9"/>
+              <w:insideH w:val="single" w:sz="4" w:color="D9D9D9"/>
+              <w:insideV w:val="single" w:sz="4" w:color="D9D9D9"/>
+            </w:tcBorders>
+            <w:tcMar>
+              <w:top w:w="90" w:type="dxa"/>
+              <w:start w:w="100" w:type="dxa"/>
+              <w:bottom w:w="90" w:type="dxa"/>
+              <w:end w:w="100" w:type="dxa"/>
+            </w:tcMar>
+            <w:vAlign w:val="center"/>
+          </w:tcPr>
+          <w:p>
+            <w:pPr>
+              <w:pStyle w:val="TableText"/>
+              <w:jc w:val="left"/>
+            </w:pPr>
+            <w:r>
+              <w:t>Terminate the Windows API process tree when the desktop window closes.</w:t>
+            </w:r>
+          </w:p>
+        </w:tc>
+        <w:tc>
+          <w:tcPr>
+            <w:tcW w:type="dxa" w:w="4766"/>
+            <w:tcBorders>
+              <w:top w:val="single" w:sz="4" w:color="D9D9D9"/>
+              <w:left w:val="single" w:sz="4" w:color="D9D9D9"/>
+              <w:bottom w:val="single" w:sz="4" w:color="D9D9D9"/>
+              <w:right w:val="single" w:sz="4" w:color="D9D9D9"/>
+              <w:insideH w:val="single" w:sz="4" w:color="D9D9D9"/>
+              <w:insideV w:val="single" w:sz="4" w:color="D9D9D9"/>
+            </w:tcBorders>
+            <w:tcMar>
+              <w:top w:w="90" w:type="dxa"/>
+              <w:start w:w="100" w:type="dxa"/>
+              <w:bottom w:w="90" w:type="dxa"/>
+              <w:end w:w="100" w:type="dxa"/>
+            </w:tcMar>
+            <w:vAlign w:val="center"/>
+          </w:tcPr>
+          <w:p>
+            <w:pPr>
+              <w:pStyle w:val="TableText"/>
+              <w:jc w:val="left"/>
+            </w:pPr>
+            <w:r>
+              <w:t>Prevents a local backend from remaining after its owning desktop shell exits.</w:t>
+            </w:r>
+          </w:p>
+        </w:tc>
+      </w:tr>
+      <w:tr>
+        <w:trPr>
+          <w:cantSplit/>
+        </w:trPr>
+        <w:tc>
+          <w:tcPr>
+            <w:tcW w:type="dxa" w:w="1843"/>
+            <w:shd w:fill="F4F8FB"/>
+            <w:tcBorders>
+              <w:top w:val="single" w:sz="4" w:color="D9D9D9"/>
+              <w:left w:val="single" w:sz="4" w:color="D9D9D9"/>
+              <w:bottom w:val="single" w:sz="4" w:color="D9D9D9"/>
+              <w:right w:val="single" w:sz="4" w:color="D9D9D9"/>
+              <w:insideH w:val="single" w:sz="4" w:color="D9D9D9"/>
+              <w:insideV w:val="single" w:sz="4" w:color="D9D9D9"/>
+            </w:tcBorders>
+            <w:tcMar>
+              <w:top w:w="90" w:type="dxa"/>
+              <w:start w:w="100" w:type="dxa"/>
+              <w:bottom w:w="90" w:type="dxa"/>
+              <w:end w:w="100" w:type="dxa"/>
+            </w:tcMar>
+            <w:vAlign w:val="center"/>
+          </w:tcPr>
+          <w:p>
+            <w:pPr>
+              <w:pStyle w:val="TableText"/>
+              <w:jc w:val="center"/>
+            </w:pPr>
+            <w:r>
               <w:t>Startup payload</w:t>
             </w:r>
           </w:p>
@@ -685,6 +778,7 @@
         <w:tc>
           <w:tcPr>
             <w:tcW w:type="dxa" w:w="3499"/>
+            <w:shd w:fill="F4F8FB"/>
             <w:tcBorders>
               <w:top w:val="single" w:sz="4" w:color="D9D9D9"/>
               <w:left w:val="single" w:sz="4" w:color="D9D9D9"/>
@@ -714,6 +808,7 @@
         <w:tc>
           <w:tcPr>
             <w:tcW w:type="dxa" w:w="4766"/>
+            <w:shd w:fill="F4F8FB"/>
             <w:tcBorders>
               <w:top w:val="single" w:sz="4" w:color="D9D9D9"/>
               <w:left w:val="single" w:sz="4" w:color="D9D9D9"/>
@@ -809,7 +904,7 @@
     </w:p>
     <w:p>
       <w:r>
-        <w:t>The Windows release executable was launched and its locally served application API was exercised through the same service created by the desktop shell. The run completed a code-only scan against a workspace target, observed a succeeded scan state with a persisted completion time, reopened a previously rejected migration task, generated a template-only candidate without invoking an external model, rejected that candidate, and verified that an attempt to apply the rejected candidate was blocked. This verifies safety transitions in the compiled application path; it does not substitute for a human usability study or a full behavioral proof of the external repositories.</w:t>
+        <w:t>The Windows release executable was launched and its locally served application API was exercised through the same service created by the desktop shell. The run completed a code-only scan against a workspace target, observed a succeeded scan state with a persisted completion time, reopened a previously rejected migration task, generated a template-only candidate without invoking an external model, rejected that candidate, and verified that an attempt to apply the rejected candidate was blocked. A subsequent normal window-close request released the local API port and left no API process behind. This verifies safety transitions and lifecycle cleanup in the compiled application path; it does not substitute for a human usability study or a full behavioral proof of the external repositories.</w:t>
       </w:r>
     </w:p>
     <w:p>
@@ -1405,6 +1500,101 @@
           </w:p>
         </w:tc>
       </w:tr>
+      <w:tr>
+        <w:trPr>
+          <w:cantSplit/>
+        </w:trPr>
+        <w:tc>
+          <w:tcPr>
+            <w:tcW w:type="dxa" w:w="2448"/>
+            <w:shd w:fill="F4F8FB"/>
+            <w:tcBorders>
+              <w:top w:val="single" w:sz="4" w:color="D9D9D9"/>
+              <w:left w:val="single" w:sz="4" w:color="D9D9D9"/>
+              <w:bottom w:val="single" w:sz="4" w:color="D9D9D9"/>
+              <w:right w:val="single" w:sz="4" w:color="D9D9D9"/>
+              <w:insideH w:val="single" w:sz="4" w:color="D9D9D9"/>
+              <w:insideV w:val="single" w:sz="4" w:color="D9D9D9"/>
+            </w:tcBorders>
+            <w:tcMar>
+              <w:top w:w="90" w:type="dxa"/>
+              <w:start w:w="100" w:type="dxa"/>
+              <w:bottom w:w="90" w:type="dxa"/>
+              <w:end w:w="100" w:type="dxa"/>
+            </w:tcMar>
+            <w:vAlign w:val="center"/>
+          </w:tcPr>
+          <w:p>
+            <w:pPr>
+              <w:pStyle w:val="TableText"/>
+              <w:jc w:val="center"/>
+            </w:pPr>
+            <w:r>
+              <w:t>Desktop shutdown</w:t>
+            </w:r>
+          </w:p>
+        </w:tc>
+        <w:tc>
+          <w:tcPr>
+            <w:tcW w:type="dxa" w:w="3456"/>
+            <w:shd w:fill="F4F8FB"/>
+            <w:tcBorders>
+              <w:top w:val="single" w:sz="4" w:color="D9D9D9"/>
+              <w:left w:val="single" w:sz="4" w:color="D9D9D9"/>
+              <w:bottom w:val="single" w:sz="4" w:color="D9D9D9"/>
+              <w:right w:val="single" w:sz="4" w:color="D9D9D9"/>
+              <w:insideH w:val="single" w:sz="4" w:color="D9D9D9"/>
+              <w:insideV w:val="single" w:sz="4" w:color="D9D9D9"/>
+            </w:tcBorders>
+            <w:tcMar>
+              <w:top w:w="90" w:type="dxa"/>
+              <w:start w:w="100" w:type="dxa"/>
+              <w:bottom w:w="90" w:type="dxa"/>
+              <w:end w:w="100" w:type="dxa"/>
+            </w:tcMar>
+            <w:vAlign w:val="center"/>
+          </w:tcPr>
+          <w:p>
+            <w:pPr>
+              <w:pStyle w:val="TableText"/>
+              <w:jc w:val="left"/>
+            </w:pPr>
+            <w:r>
+              <w:t>Window close released port 8787; no API process remained</w:t>
+            </w:r>
+          </w:p>
+        </w:tc>
+        <w:tc>
+          <w:tcPr>
+            <w:tcW w:type="dxa" w:w="4205"/>
+            <w:shd w:fill="F4F8FB"/>
+            <w:tcBorders>
+              <w:top w:val="single" w:sz="4" w:color="D9D9D9"/>
+              <w:left w:val="single" w:sz="4" w:color="D9D9D9"/>
+              <w:bottom w:val="single" w:sz="4" w:color="D9D9D9"/>
+              <w:right w:val="single" w:sz="4" w:color="D9D9D9"/>
+              <w:insideH w:val="single" w:sz="4" w:color="D9D9D9"/>
+              <w:insideV w:val="single" w:sz="4" w:color="D9D9D9"/>
+            </w:tcBorders>
+            <w:tcMar>
+              <w:top w:w="90" w:type="dxa"/>
+              <w:start w:w="100" w:type="dxa"/>
+              <w:bottom w:w="90" w:type="dxa"/>
+              <w:end w:w="100" w:type="dxa"/>
+            </w:tcMar>
+            <w:vAlign w:val="center"/>
+          </w:tcPr>
+          <w:p>
+            <w:pPr>
+              <w:pStyle w:val="TableText"/>
+              <w:jc w:val="left"/>
+            </w:pPr>
+            <w:r>
+              <w:t>The local server process tree is owned by the desktop shell.</w:t>
+            </w:r>
+          </w:p>
+        </w:tc>
+      </w:tr>
     </w:tbl>
     <w:p>
       <w:pPr>
@@ -1504,7 +1694,7 @@
     </w:p>
     <w:p>
       <w:r>
-        <w:t>QUBIT is a research prototype for evidence-gated source-level PQC migration. Its contribution is not a claim that automated replacement can safely solve every cryptographic migration. Instead, it provides a workflow in which discovery, ownership reasoning, candidate generation, validation evidence, and approval are separable and auditable. The release hardening strengthens the integrity of that workflow: stale evidence is re-anchored or deferred, rejected work can be reconsidered without losing history, external processing is opt-in, sandbox selection is deterministic, and the desktop payload is smaller without a behavior change. The fixed verification snapshot demonstrates these release properties while preserving the distinction between an exercised gate and a proven migration outcome. That distinction is the foundation for a stronger future empirical evaluation.</w:t>
+        <w:t>QUBIT is a research prototype for evidence-gated source-level PQC migration. Its contribution is not a claim that automated replacement can safely solve every cryptographic migration. Instead, it provides a workflow in which discovery, ownership reasoning, candidate generation, validation evidence, and approval are separable and auditable. The release hardening strengthens the integrity of that workflow: stale evidence is re-anchored or deferred, rejected work can be reconsidered without losing history, external processing is opt-in, sandbox selection is deterministic, the local server tree stops with its desktop owner, and the desktop payload is smaller without a behavior change. The fixed verification snapshot demonstrates these release properties while preserving the distinction between an exercised gate and a proven migration outcome. That distinction is the foundation for a stronger future empirical evaluation.</w:t>
       </w:r>
     </w:p>
     <w:p>
@@ -1985,11 +2175,11 @@
     <w:qFormat/>
     <w:rsid w:val="00FC693F"/>
     <w:pPr>
-      <w:spacing w:after="80" w:line="254" w:lineRule="auto"/>
+      <w:spacing w:after="70" w:line="245" w:lineRule="auto"/>
     </w:pPr>
     <w:rPr>
       <w:rFonts w:ascii="Times New Roman" w:hAnsi="Times New Roman"/>
-      <w:sz w:val="20"/>
+      <w:sz w:val="19"/>
     </w:rPr>
   </w:style>
   <w:style w:type="paragraph" w:styleId="Header">
@@ -2047,7 +2237,7 @@
     <w:pPr>
       <w:keepNext/>
       <w:keepLines/>
-      <w:spacing w:before="200" w:after="80"/>
+      <w:spacing w:before="180" w:after="60"/>
       <w:outlineLvl w:val="0"/>
     </w:pPr>
     <w:rPr>
@@ -2055,7 +2245,7 @@
       <w:b/>
       <w:bCs/>
       <w:color w:val="000000"/>
-      <w:sz w:val="24"/>
+      <w:sz w:val="23"/>
       <w:szCs w:val="28"/>
     </w:rPr>
   </w:style>
@@ -2071,7 +2261,7 @@
     <w:pPr>
       <w:keepNext/>
       <w:keepLines/>
-      <w:spacing w:before="140" w:after="60"/>
+      <w:spacing w:before="120" w:after="50"/>
       <w:outlineLvl w:val="1"/>
     </w:pPr>
     <w:rPr>

</xml_diff>